<commit_message>
Sprint 2: BD y catálogo
</commit_message>
<xml_diff>
--- a/Plantilla_Scrum_P2_ModaApp.docx
+++ b/Plantilla_Scrum_P2_ModaApp.docx
@@ -6369,7 +6369,7 @@
                 <w:sz w:val="19"/>
                 <w:szCs w:val="19"/>
               </w:rPr>
-              <w:t>â˜</w:t>
+              <w:t>☑ Hecho</w:t>
             </w:r>
           </w:p>
         </w:tc>
@@ -6567,7 +6567,7 @@
                 <w:sz w:val="19"/>
                 <w:szCs w:val="19"/>
               </w:rPr>
-              <w:t>â˜</w:t>
+              <w:t>☑ Hecho</w:t>
             </w:r>
           </w:p>
         </w:tc>
@@ -6771,7 +6771,7 @@
                 <w:sz w:val="19"/>
                 <w:szCs w:val="19"/>
               </w:rPr>
-              <w:t>â˜</w:t>
+              <w:t>☑ Hecho</w:t>
             </w:r>
           </w:p>
         </w:tc>
@@ -15423,7 +15423,7 @@
                 <w:sz w:val="19"/>
                 <w:szCs w:val="19"/>
               </w:rPr>
-              <w:t xml:space="preserve">â˜  Crear la tabla usuario e insertar el </w:t>
+              <w:t xml:space="preserve">☑  Crear la tabla usuario e insertar el admin en onCreate; activar FOREIGN KEY en onConfigure</w:t>
             </w:r>
             <w:proofErr w:type="spellStart"/>
             <w:r>
@@ -15604,7 +15604,7 @@
                 <w:sz w:val="19"/>
                 <w:szCs w:val="19"/>
               </w:rPr>
-              <w:t xml:space="preserve">â˜ Por hacer     â˜ En curso     â˜ Hecho          </w:t>
+              <w:t xml:space="preserve">☐ Por hacer     ☐ En curso     ☑ Hecho          Commit: Sprint 2: BD y catÃ¡logo</w:t>
             </w:r>
             <w:proofErr w:type="spellStart"/>
             <w:r>
@@ -16381,7 +16381,7 @@
                 <w:sz w:val="19"/>
                 <w:szCs w:val="19"/>
               </w:rPr>
-              <w:t>â˜  Elegir la foto con registerForActivityResult(ActivityResultContracts.PickVisualMedia())</w:t>
+              <w:t>☑  Elegir la foto con registerForActivityResult(ActivityResultContracts.PickVisualMedia())</w:t>
             </w:r>
           </w:p>
           <w:p>
@@ -16576,7 +16576,7 @@
                 <w:sz w:val="19"/>
                 <w:szCs w:val="19"/>
               </w:rPr>
-              <w:t xml:space="preserve">â˜ Por hacer     â˜ En curso     â˜ Hecho          </w:t>
+              <w:t xml:space="preserve">☐ Por hacer     ☐ En curso     ☑ Hecho          Commit: Sprint 2: BD y catÃ¡logo</w:t>
             </w:r>
             <w:proofErr w:type="spellStart"/>
             <w:r>
@@ -17263,7 +17263,7 @@
                 <w:sz w:val="19"/>
                 <w:szCs w:val="19"/>
               </w:rPr>
-              <w:t>RopaDao.listarDisponibles</w:t>
+              <w:t>☑  RopaDao.listarDisponibles(idCategoria) con WHERE cantidad &gt; 0</w:t>
             </w:r>
             <w:proofErr w:type="spellEnd"/>
             <w:r>
@@ -17451,7 +17451,7 @@
                 <w:sz w:val="19"/>
                 <w:szCs w:val="19"/>
               </w:rPr>
-              <w:t xml:space="preserve">â˜ Por hacer     â˜ En curso     â˜ Hecho          </w:t>
+              <w:t xml:space="preserve">☐ Por hacer     ☐ En curso     ☑ Hecho          Commit: Sprint 2: BD y catÃ¡logo</w:t>
             </w:r>
             <w:proofErr w:type="spellStart"/>
             <w:r>
@@ -17687,6 +17687,13 @@
             <w:pPr>
               <w:spacing w:after="40"/>
             </w:pPr>
+            <w:r>
+              <w:rPr>
+                <w:sz w:val="19"/>
+                <w:szCs w:val="19"/>
+              </w:rPr>
+              <w:t>05/10/2026</w:t>
+            </w:r>
           </w:p>
         </w:tc>
         <w:tc>
@@ -17709,6 +17716,13 @@
             <w:pPr>
               <w:spacing w:after="40"/>
             </w:pPr>
+            <w:r>
+              <w:rPr>
+                <w:sz w:val="19"/>
+                <w:szCs w:val="19"/>
+              </w:rPr>
+              <w:t>CreaciÃ³n de DBHelper.kt con base de datos modaapp.db, tablas usuario, categoria y ropa. ActivaciÃ³n de claves forÃ¡neas e inserciÃ³n de admin y 5 categorÃ­as iniciales.</w:t>
+            </w:r>
           </w:p>
         </w:tc>
         <w:tc>
@@ -17731,6 +17745,13 @@
             <w:pPr>
               <w:spacing w:after="40"/>
             </w:pPr>
+            <w:r>
+              <w:rPr>
+                <w:sz w:val="19"/>
+                <w:szCs w:val="19"/>
+              </w:rPr>
+              <w:t>Implementar autenticaciÃ³n parametrizada en UsuarioDao e integrar LoginActivity con SQLite.</w:t>
+            </w:r>
           </w:p>
         </w:tc>
         <w:tc>
@@ -17753,6 +17774,13 @@
             <w:pPr>
               <w:spacing w:after="40"/>
             </w:pPr>
+            <w:r>
+              <w:rPr>
+                <w:sz w:val="19"/>
+                <w:szCs w:val="19"/>
+              </w:rPr>
+              <w:t>Ninguno</w:t>
+            </w:r>
           </w:p>
         </w:tc>
       </w:tr>
@@ -17784,6 +17812,13 @@
             <w:pPr>
               <w:spacing w:after="40"/>
             </w:pPr>
+            <w:r>
+              <w:rPr>
+                <w:sz w:val="19"/>
+                <w:szCs w:val="19"/>
+              </w:rPr>
+              <w:t>05/10/2026</w:t>
+            </w:r>
           </w:p>
         </w:tc>
         <w:tc>
@@ -17807,6 +17842,13 @@
             <w:pPr>
               <w:spacing w:after="40"/>
             </w:pPr>
+            <w:r>
+              <w:rPr>
+                <w:sz w:val="19"/>
+                <w:szCs w:val="19"/>
+              </w:rPr>
+              <w:t>Desarrollo de RegistrarRopaActivity con selecciÃ³n y copia de fotos a filesDir, validaciones de campos y RopaDao. ImplementaciÃ³n de RopaAdapter e inventario en RopaActivity.</w:t>
+            </w:r>
           </w:p>
         </w:tc>
         <w:tc>
@@ -17830,6 +17872,13 @@
             <w:pPr>
               <w:spacing w:after="40"/>
             </w:pPr>
+            <w:r>
+              <w:rPr>
+                <w:sz w:val="19"/>
+                <w:szCs w:val="19"/>
+              </w:rPr>
+              <w:t>Conectar el catÃ¡logo del cliente con ChipGroup dinÃ¡mico y filtro cantidad &gt; 0 en CatalogoActivity.</w:t>
+            </w:r>
           </w:p>
         </w:tc>
         <w:tc>
@@ -17853,6 +17902,13 @@
             <w:pPr>
               <w:spacing w:after="40"/>
             </w:pPr>
+            <w:r>
+              <w:rPr>
+                <w:sz w:val="19"/>
+                <w:szCs w:val="19"/>
+              </w:rPr>
+              <w:t>Ninguno</w:t>
+            </w:r>
           </w:p>
         </w:tc>
       </w:tr>
@@ -18144,7 +18200,7 @@
                 <w:sz w:val="19"/>
                 <w:szCs w:val="19"/>
               </w:rPr>
-              <w:t>â˜ SÃ­   â˜ No</w:t>
+              <w:t>☑ SÃ­   ☐ No</w:t>
             </w:r>
           </w:p>
         </w:tc>
@@ -18168,6 +18224,13 @@
             <w:pPr>
               <w:spacing w:after="40"/>
             </w:pPr>
+            <w:r>
+              <w:rPr>
+                <w:sz w:val="19"/>
+                <w:szCs w:val="19"/>
+              </w:rPr>
+              <w:t>Commit: Sprint 2: BD y catÃ¡logo. Base de datos modaapp.db creada, usuario admin autenticado mediante consulta parametrizada y datos mostrados en menÃº.</w:t>
+            </w:r>
           </w:p>
         </w:tc>
         <w:tc>
@@ -18190,6 +18253,13 @@
             <w:pPr>
               <w:spacing w:after="40"/>
             </w:pPr>
+            <w:r>
+              <w:rPr>
+                <w:sz w:val="19"/>
+                <w:szCs w:val="19"/>
+              </w:rPr>
+              <w:t>Aprobado</w:t>
+            </w:r>
           </w:p>
         </w:tc>
       </w:tr>
@@ -18256,7 +18326,7 @@
                 <w:sz w:val="19"/>
                 <w:szCs w:val="19"/>
               </w:rPr>
-              <w:t>â˜ SÃ­   â˜ No</w:t>
+              <w:t>☑ SÃ­   ☐ No</w:t>
             </w:r>
           </w:p>
         </w:tc>
@@ -18281,6 +18351,13 @@
             <w:pPr>
               <w:spacing w:after="40"/>
             </w:pPr>
+            <w:r>
+              <w:rPr>
+                <w:sz w:val="19"/>
+                <w:szCs w:val="19"/>
+              </w:rPr>
+              <w:t>Commit: Sprint 2: BD y catÃ¡logo. Formulario RegistrarRopaActivity validando campos y precios &gt; 0, almacenamiento de foto en filesDir y visualizaciÃ³n en lista RopaActivity.</w:t>
+            </w:r>
           </w:p>
         </w:tc>
         <w:tc>
@@ -18304,6 +18381,13 @@
             <w:pPr>
               <w:spacing w:after="40"/>
             </w:pPr>
+            <w:r>
+              <w:rPr>
+                <w:sz w:val="19"/>
+                <w:szCs w:val="19"/>
+              </w:rPr>
+              <w:t>Aprobado</w:t>
+            </w:r>
           </w:p>
         </w:tc>
       </w:tr>
@@ -18369,7 +18453,7 @@
                 <w:sz w:val="19"/>
                 <w:szCs w:val="19"/>
               </w:rPr>
-              <w:t>â˜ SÃ­   â˜ No</w:t>
+              <w:t>☑ SÃ­   ☐ No</w:t>
             </w:r>
           </w:p>
         </w:tc>
@@ -18393,6 +18477,13 @@
             <w:pPr>
               <w:spacing w:after="40"/>
             </w:pPr>
+            <w:r>
+              <w:rPr>
+                <w:sz w:val="19"/>
+                <w:szCs w:val="19"/>
+              </w:rPr>
+              <w:t>Commit: Sprint 2: BD y catÃ¡logo. CatalogoActivity con chips dinÃ¡micos por categorÃ­a, grilla de 2 columnas y exclusiÃ³n de prendas con stock 0.</w:t>
+            </w:r>
           </w:p>
         </w:tc>
         <w:tc>
@@ -18415,6 +18506,13 @@
             <w:pPr>
               <w:spacing w:after="40"/>
             </w:pPr>
+            <w:r>
+              <w:rPr>
+                <w:sz w:val="19"/>
+                <w:szCs w:val="19"/>
+              </w:rPr>
+              <w:t>Aprobado</w:t>
+            </w:r>
           </w:p>
         </w:tc>
       </w:tr>
@@ -18589,6 +18687,13 @@
             <w:pPr>
               <w:spacing w:after="40"/>
             </w:pPr>
+            <w:r>
+              <w:rPr>
+                <w:sz w:val="19"/>
+                <w:szCs w:val="19"/>
+              </w:rPr>
+              <w:t>La arquitectura modular con DBHelper, modelos y DAOs desacoplÃ³ efectivamente la base de datos de las interfaces visuales. La copia de imÃ¡genes locales a filesDir garantizÃ³ persistencia confiable.</w:t>
+            </w:r>
           </w:p>
         </w:tc>
         <w:tc>
@@ -18611,6 +18716,13 @@
             <w:pPr>
               <w:spacing w:after="40"/>
             </w:pPr>
+            <w:r>
+              <w:rPr>
+                <w:sz w:val="19"/>
+                <w:szCs w:val="19"/>
+              </w:rPr>
+              <w:t>Planificar la actualizaciÃ³n de base de datos a DB_VERSION = 2 mediante onUpgrade sin pÃ©rdida de datos para el Sprint 3.</w:t>
+            </w:r>
           </w:p>
         </w:tc>
         <w:tc>
@@ -18633,6 +18745,13 @@
             <w:pPr>
               <w:spacing w:after="40"/>
             </w:pPr>
+            <w:r>
+              <w:rPr>
+                <w:sz w:val="19"/>
+                <w:szCs w:val="19"/>
+              </w:rPr>
+              <w:t>DiseÃ±ar la estructura del Carrito de compras y la creaciÃ³n transaccional de pedidos y detalle de pedidos para el Sprint 3.</w:t>
+            </w:r>
           </w:p>
         </w:tc>
       </w:tr>
@@ -28975,6 +29094,13 @@
             <w:pPr>
               <w:spacing w:after="40"/>
             </w:pPr>
+            <w:r>
+              <w:rPr>
+                <w:sz w:val="19"/>
+                <w:szCs w:val="19"/>
+              </w:rPr>
+              <w:t>16</w:t>
+            </w:r>
           </w:p>
         </w:tc>
         <w:tc>
@@ -28998,6 +29124,13 @@
             <w:pPr>
               <w:spacing w:after="40"/>
             </w:pPr>
+            <w:r>
+              <w:rPr>
+                <w:sz w:val="19"/>
+                <w:szCs w:val="19"/>
+              </w:rPr>
+              <w:t>100%</w:t>
+            </w:r>
           </w:p>
         </w:tc>
       </w:tr>

</xml_diff>

<commit_message>
Sprint 3: carrito y pedidos
</commit_message>
<xml_diff>
--- a/Plantilla_Scrum_P2_ModaApp.docx
+++ b/Plantilla_Scrum_P2_ModaApp.docx
@@ -6969,7 +6969,7 @@
                 <w:sz w:val="19"/>
                 <w:szCs w:val="19"/>
               </w:rPr>
-              <w:t>â˜</w:t>
+              <w:t>☑ Hecho</w:t>
             </w:r>
           </w:p>
         </w:tc>
@@ -7173,7 +7173,7 @@
                 <w:sz w:val="19"/>
                 <w:szCs w:val="19"/>
               </w:rPr>
-              <w:t>â˜</w:t>
+              <w:t>☑ Hecho</w:t>
             </w:r>
           </w:p>
         </w:tc>
@@ -7371,7 +7371,7 @@
                 <w:sz w:val="19"/>
                 <w:szCs w:val="19"/>
               </w:rPr>
-              <w:t>â˜</w:t>
+              <w:t>☑ Hecho</w:t>
             </w:r>
           </w:p>
         </w:tc>
@@ -19775,7 +19775,7 @@
                 <w:sz w:val="19"/>
                 <w:szCs w:val="19"/>
               </w:rPr>
-              <w:t xml:space="preserve">â˜  obtener(), actualizar(), eliminar(), listar(filtro) en </w:t>
+              <w:t xml:space="preserve">☑  obtener(), actualizar(), eliminar(), listar(filtro) en RopaDao</w:t>
             </w:r>
             <w:proofErr w:type="spellStart"/>
             <w:r>
@@ -19861,7 +19861,7 @@
                 <w:sz w:val="19"/>
                 <w:szCs w:val="19"/>
               </w:rPr>
-              <w:t>â˜  Buscador con LIKE en modelo, marca y color</w:t>
+              <w:t>☑  Buscador con LIKE en modelo, marca y color</w:t>
             </w:r>
           </w:p>
         </w:tc>
@@ -19936,7 +19936,7 @@
                 <w:sz w:val="19"/>
                 <w:szCs w:val="19"/>
               </w:rPr>
-              <w:t xml:space="preserve">â˜ Por hacer     â˜ En curso     â˜ Hecho          </w:t>
+              <w:t xml:space="preserve">☐ Por hacer     ☐ En curso     ☑ Hecho          Commit: Sprint 3: carrito y pedidos</w:t>
             </w:r>
             <w:proofErr w:type="spellStart"/>
             <w:r>
@@ -20696,7 +20696,7 @@
                 <w:sz w:val="19"/>
                 <w:szCs w:val="19"/>
               </w:rPr>
-              <w:t xml:space="preserve">â˜  Ãcono de carrito con contador en </w:t>
+              <w:t xml:space="preserve">☑  Ãcono de carrito con contador en CatalogoActivity</w:t>
             </w:r>
             <w:proofErr w:type="spellStart"/>
             <w:r>
@@ -20832,7 +20832,7 @@
                 <w:sz w:val="19"/>
                 <w:szCs w:val="19"/>
               </w:rPr>
-              <w:t xml:space="preserve">â˜ Por hacer     â˜ En curso     â˜ Hecho          </w:t>
+              <w:t xml:space="preserve">☐ Por hacer     ☐ En curso     ☑ Hecho          Commit: Sprint 3: carrito y pedidos</w:t>
             </w:r>
             <w:proofErr w:type="spellStart"/>
             <w:r>
@@ -21597,7 +21597,7 @@
                 <w:sz w:val="19"/>
                 <w:szCs w:val="19"/>
               </w:rPr>
-              <w:t xml:space="preserve">â˜  DB_VERSION = 2 con tablas cliente, pedido y </w:t>
+              <w:t xml:space="preserve">☑  DB_VERSION = 2 con tablas cliente, pedido y detalle_pedido (onUpgrade)</w:t>
             </w:r>
             <w:proofErr w:type="spellStart"/>
             <w:r>
@@ -21649,7 +21649,7 @@
                 <w:sz w:val="19"/>
                 <w:szCs w:val="19"/>
               </w:rPr>
-              <w:t>ClienteDao.buscarPorTelefono</w:t>
+              <w:t>☑  ClienteDao.buscarPorTelefono() e insertar()</w:t>
             </w:r>
             <w:proofErr w:type="spellEnd"/>
             <w:r>
@@ -21677,7 +21677,7 @@
                 <w:sz w:val="19"/>
                 <w:szCs w:val="19"/>
               </w:rPr>
-              <w:t>PedidoDao.registrar</w:t>
+              <w:t>☑  PedidoDao.registrar(idCliente, items) con beginTransaction / setTransactionSuccessful / endTransaction</w:t>
             </w:r>
             <w:proofErr w:type="spellEnd"/>
             <w:r>
@@ -21877,7 +21877,7 @@
                 <w:sz w:val="19"/>
                 <w:szCs w:val="19"/>
               </w:rPr>
-              <w:t xml:space="preserve">â˜ Por hacer     â˜ En curso     â˜ Hecho          </w:t>
+              <w:t xml:space="preserve">☐ Por hacer     ☐ En curso     ☑ Hecho          Commit: Sprint 3: carrito y pedidos</w:t>
             </w:r>
             <w:proofErr w:type="spellStart"/>
             <w:r>
@@ -22113,6 +22113,13 @@
             <w:pPr>
               <w:spacing w:after="40"/>
             </w:pPr>
+            <w:r>
+              <w:rPr>
+                <w:sz w:val="19"/>
+                <w:szCs w:val="19"/>
+              </w:rPr>
+              <w:t>05/10/2026</w:t>
+            </w:r>
           </w:p>
         </w:tc>
         <w:tc>
@@ -22135,6 +22142,13 @@
             <w:pPr>
               <w:spacing w:after="40"/>
             </w:pPr>
+            <w:r>
+              <w:rPr>
+                <w:sz w:val="19"/>
+                <w:szCs w:val="19"/>
+              </w:rPr>
+              <w:t>ActualizaciÃ³n a DB_VERSION = 2 con tablas cliente, pedido y detalle_pedido. ImplementaciÃ³n de ediciÃ³n y eliminaciÃ³n controlada en RegistrarRopaActivity y RopaDao.</w:t>
+            </w:r>
           </w:p>
         </w:tc>
         <w:tc>
@@ -22157,6 +22171,13 @@
             <w:pPr>
               <w:spacing w:after="40"/>
             </w:pPr>
+            <w:r>
+              <w:rPr>
+                <w:sz w:val="19"/>
+                <w:szCs w:val="19"/>
+              </w:rPr>
+              <w:t>Implementar singleton Carrito, selector de cantidad con lÃ­mite de stock en catÃ¡logo y eliminaciÃ³n por pulsaciÃ³n prolongada en CarritoActivity.</w:t>
+            </w:r>
           </w:p>
         </w:tc>
         <w:tc>
@@ -22179,6 +22200,13 @@
             <w:pPr>
               <w:spacing w:after="40"/>
             </w:pPr>
+            <w:r>
+              <w:rPr>
+                <w:sz w:val="19"/>
+                <w:szCs w:val="19"/>
+              </w:rPr>
+              <w:t>Ninguno</w:t>
+            </w:r>
           </w:p>
         </w:tc>
       </w:tr>
@@ -22210,6 +22238,13 @@
             <w:pPr>
               <w:spacing w:after="40"/>
             </w:pPr>
+            <w:r>
+              <w:rPr>
+                <w:sz w:val="19"/>
+                <w:szCs w:val="19"/>
+              </w:rPr>
+              <w:t>05/10/2026</w:t>
+            </w:r>
           </w:p>
         </w:tc>
         <w:tc>
@@ -22233,6 +22268,13 @@
             <w:pPr>
               <w:spacing w:after="40"/>
             </w:pPr>
+            <w:r>
+              <w:rPr>
+                <w:sz w:val="19"/>
+                <w:szCs w:val="19"/>
+              </w:rPr>
+              <w:t>Desarrollo de PedidoActivity con detecciÃ³n de telÃ©fono a 9 dÃ­gitos, reconocimiento de clientes existentes y transacciÃ³n atÃ³mica en PedidoDao con descuento de stock.</w:t>
+            </w:r>
           </w:p>
         </w:tc>
         <w:tc>
@@ -22256,6 +22298,13 @@
             <w:pPr>
               <w:spacing w:after="40"/>
             </w:pPr>
+            <w:r>
+              <w:rPr>
+                <w:sz w:val="19"/>
+                <w:szCs w:val="19"/>
+              </w:rPr>
+              <w:t>Verificar criterios de aceptaciÃ³n de HU-07, HU-08 y HU-09, compilaciÃ³n limpia y commit de Sprint 3.</w:t>
+            </w:r>
           </w:p>
         </w:tc>
         <w:tc>
@@ -22279,6 +22328,13 @@
             <w:pPr>
               <w:spacing w:after="40"/>
             </w:pPr>
+            <w:r>
+              <w:rPr>
+                <w:sz w:val="19"/>
+                <w:szCs w:val="19"/>
+              </w:rPr>
+              <w:t>Ninguno</w:t>
+            </w:r>
           </w:p>
         </w:tc>
       </w:tr>
@@ -22570,7 +22626,7 @@
                 <w:sz w:val="19"/>
                 <w:szCs w:val="19"/>
               </w:rPr>
-              <w:t>â˜ SÃ­   â˜ No</w:t>
+              <w:t>☑ SÃ­   ☐ No</w:t>
             </w:r>
           </w:p>
         </w:tc>
@@ -22594,6 +22650,13 @@
             <w:pPr>
               <w:spacing w:after="40"/>
             </w:pPr>
+            <w:r>
+              <w:rPr>
+                <w:sz w:val="19"/>
+                <w:szCs w:val="19"/>
+              </w:rPr>
+              <w:t>Commit: Sprint 3: carrito y pedidos. EdiciÃ³n funcional de prendas, botÃ³n de eliminar con AlertDialog y control de restricciÃ³n por pedidos, buscador en tiempo real por modelo, marca y color.</w:t>
+            </w:r>
           </w:p>
         </w:tc>
         <w:tc>
@@ -22616,6 +22679,13 @@
             <w:pPr>
               <w:spacing w:after="40"/>
             </w:pPr>
+            <w:r>
+              <w:rPr>
+                <w:sz w:val="19"/>
+                <w:szCs w:val="19"/>
+              </w:rPr>
+              <w:t>Aprobado</w:t>
+            </w:r>
           </w:p>
         </w:tc>
       </w:tr>
@@ -22682,7 +22752,7 @@
                 <w:sz w:val="19"/>
                 <w:szCs w:val="19"/>
               </w:rPr>
-              <w:t>â˜ SÃ­   â˜ No</w:t>
+              <w:t>☑ SÃ­   ☐ No</w:t>
             </w:r>
           </w:p>
         </w:tc>
@@ -22707,6 +22777,13 @@
             <w:pPr>
               <w:spacing w:after="40"/>
             </w:pPr>
+            <w:r>
+              <w:rPr>
+                <w:sz w:val="19"/>
+                <w:szCs w:val="19"/>
+              </w:rPr>
+              <w:t>Commit: Sprint 3: carrito y pedidos. Carrito de compras con NumberPicker restringido a stock disponible (Â«Disponible: NÂ»), eliminaciÃ³n por pulsaciÃ³n larga y desactivaciÃ³n en estado vacÃ­o.</w:t>
+            </w:r>
           </w:p>
         </w:tc>
         <w:tc>
@@ -22730,6 +22807,13 @@
             <w:pPr>
               <w:spacing w:after="40"/>
             </w:pPr>
+            <w:r>
+              <w:rPr>
+                <w:sz w:val="19"/>
+                <w:szCs w:val="19"/>
+              </w:rPr>
+              <w:t>Aprobado</w:t>
+            </w:r>
           </w:p>
         </w:tc>
       </w:tr>
@@ -22794,7 +22878,7 @@
                 <w:sz w:val="19"/>
                 <w:szCs w:val="19"/>
               </w:rPr>
-              <w:t>â˜ SÃ­   â˜ No</w:t>
+              <w:t>☑ SÃ­   ☐ No</w:t>
             </w:r>
           </w:p>
         </w:tc>
@@ -22818,6 +22902,13 @@
             <w:pPr>
               <w:spacing w:after="40"/>
             </w:pPr>
+            <w:r>
+              <w:rPr>
+                <w:sz w:val="19"/>
+                <w:szCs w:val="19"/>
+              </w:rPr>
+              <w:t>Commit: Sprint 3: carrito y pedidos. DetecciÃ³n automÃ¡tica de telÃ©fono a 9 dÃ­gitos (Â«Hola, LucÃ­aÂ»), registro dinÃ¡mico de cliente nuevo y transacciÃ³n atÃ³mica de pedido y detalle con vaciado de carrito.</w:t>
+            </w:r>
           </w:p>
         </w:tc>
         <w:tc>
@@ -22840,6 +22931,13 @@
             <w:pPr>
               <w:spacing w:after="40"/>
             </w:pPr>
+            <w:r>
+              <w:rPr>
+                <w:sz w:val="19"/>
+                <w:szCs w:val="19"/>
+              </w:rPr>
+              <w:t>Aprobado</w:t>
+            </w:r>
           </w:p>
         </w:tc>
       </w:tr>
@@ -23014,6 +23112,13 @@
             <w:pPr>
               <w:spacing w:after="40"/>
             </w:pPr>
+            <w:r>
+              <w:rPr>
+                <w:sz w:val="19"/>
+                <w:szCs w:val="19"/>
+              </w:rPr>
+              <w:t>La gestiÃ³n transaccional con beginTransaction() en SQLite evitÃ³ inconsistencias entre stock y pedidos. El flujo de validaciÃ³n automÃ¡tica por telÃ©fono de 9 dÃ­gitos resultÃ³ sumamente intuitivo.</w:t>
+            </w:r>
           </w:p>
         </w:tc>
         <w:tc>
@@ -23036,6 +23141,13 @@
             <w:pPr>
               <w:spacing w:after="40"/>
             </w:pPr>
+            <w:r>
+              <w:rPr>
+                <w:sz w:val="19"/>
+                <w:szCs w:val="19"/>
+              </w:rPr>
+              <w:t>Preparar la apertura de intents a WhatsApp y la generaciÃ³n de reportes consolidados para el Sprint 4.</w:t>
+            </w:r>
           </w:p>
         </w:tc>
         <w:tc>
@@ -23058,6 +23170,13 @@
             <w:pPr>
               <w:spacing w:after="40"/>
             </w:pPr>
+            <w:r>
+              <w:rPr>
+                <w:sz w:val="19"/>
+                <w:szCs w:val="19"/>
+              </w:rPr>
+              <w:t>Implementar HU-10 (WhatsApp wa.me), HU-11 (atenciÃ³n de pedidos), HU-12 (reportes) y HU-13 (APK) en el Sprint 4.</w:t>
+            </w:r>
           </w:p>
         </w:tc>
       </w:tr>
@@ -29219,6 +29338,13 @@
             <w:pPr>
               <w:spacing w:after="40"/>
             </w:pPr>
+            <w:r>
+              <w:rPr>
+                <w:sz w:val="19"/>
+                <w:szCs w:val="19"/>
+              </w:rPr>
+              <w:t>16</w:t>
+            </w:r>
           </w:p>
         </w:tc>
         <w:tc>
@@ -29241,6 +29367,13 @@
             <w:pPr>
               <w:spacing w:after="40"/>
             </w:pPr>
+            <w:r>
+              <w:rPr>
+                <w:sz w:val="19"/>
+                <w:szCs w:val="19"/>
+              </w:rPr>
+              <w:t>100%</w:t>
+            </w:r>
           </w:p>
         </w:tc>
       </w:tr>

</xml_diff>

<commit_message>
Sprint 4: reportes, sesión y APK
</commit_message>
<xml_diff>
--- a/Plantilla_Scrum_P2_ModaApp.docx
+++ b/Plantilla_Scrum_P2_ModaApp.docx
@@ -7591,7 +7591,7 @@
                 <w:sz w:val="19"/>
                 <w:szCs w:val="19"/>
               </w:rPr>
-              <w:t>â˜</w:t>
+              <w:t>☑ Hecho</w:t>
             </w:r>
           </w:p>
         </w:tc>
@@ -7789,7 +7789,7 @@
                 <w:sz w:val="19"/>
                 <w:szCs w:val="19"/>
               </w:rPr>
-              <w:t>â˜</w:t>
+              <w:t>☑ Hecho</w:t>
             </w:r>
           </w:p>
         </w:tc>
@@ -7993,7 +7993,7 @@
                 <w:sz w:val="19"/>
                 <w:szCs w:val="19"/>
               </w:rPr>
-              <w:t>â˜</w:t>
+              <w:t>☑ Hecho</w:t>
             </w:r>
           </w:p>
         </w:tc>
@@ -8191,7 +8191,7 @@
                 <w:sz w:val="19"/>
                 <w:szCs w:val="19"/>
               </w:rPr>
-              <w:t>â˜</w:t>
+              <w:t>☑ Hecho</w:t>
             </w:r>
           </w:p>
         </w:tc>
@@ -24509,7 +24509,7 @@
                 <w:sz w:val="19"/>
                 <w:szCs w:val="19"/>
               </w:rPr>
-              <w:t>â˜  Leer el telÃ©fono del administrador desde la tabla usuario</w:t>
+              <w:t>☑  Leer el telÃ©fono del administrador desde la tabla usuario</w:t>
             </w:r>
           </w:p>
           <w:p>
@@ -24605,7 +24605,7 @@
                 <w:sz w:val="19"/>
                 <w:szCs w:val="19"/>
               </w:rPr>
-              <w:t xml:space="preserve">â˜ Por hacer     â˜ En curso     â˜ Hecho          </w:t>
+              <w:t xml:space="preserve">☐ Por hacer     ☐ En curso     ☑ Hecho          Commit: Sprint 4: reportes, sesiÃ³n y APK</w:t>
             </w:r>
             <w:proofErr w:type="spellStart"/>
             <w:r>
@@ -25362,7 +25362,7 @@
                 <w:sz w:val="19"/>
                 <w:szCs w:val="19"/>
               </w:rPr>
-              <w:t>PedidoDao.listarPorEstado</w:t>
+              <w:t>☑  PedidoDao.listarPorEstado(estado) con JOIN cliente</w:t>
             </w:r>
             <w:proofErr w:type="spellEnd"/>
             <w:r>
@@ -25390,7 +25390,7 @@
                 <w:sz w:val="19"/>
                 <w:szCs w:val="19"/>
               </w:rPr>
-              <w:t>PedidoDao.atender</w:t>
+              <w:t>☑  PedidoDao.atender(idPedido) con transacciÃ³n y validaciÃ³n de stock</w:t>
             </w:r>
             <w:proofErr w:type="spellEnd"/>
             <w:r>
@@ -25526,7 +25526,7 @@
                 <w:sz w:val="19"/>
                 <w:szCs w:val="19"/>
               </w:rPr>
-              <w:t xml:space="preserve">â˜ Por hacer     â˜ En curso     â˜ Hecho          </w:t>
+              <w:t xml:space="preserve">☐ Por hacer     ☐ En curso     ☑ Hecho          Commit: Sprint 4: reportes, sesiÃ³n y APK</w:t>
             </w:r>
             <w:proofErr w:type="spellStart"/>
             <w:r>
@@ -26350,7 +26350,7 @@
                 <w:sz w:val="19"/>
                 <w:szCs w:val="19"/>
               </w:rPr>
-              <w:t xml:space="preserve">â˜  Probar las consultas en </w:t>
+              <w:t xml:space="preserve">☑  Probar las consultas en Database Inspector</w:t>
             </w:r>
             <w:proofErr w:type="spellStart"/>
             <w:r>
@@ -26441,7 +26441,7 @@
                 <w:sz w:val="19"/>
                 <w:szCs w:val="19"/>
               </w:rPr>
-              <w:t xml:space="preserve">â˜ Por hacer     â˜ En curso     â˜ Hecho          </w:t>
+              <w:t xml:space="preserve">☐ Por hacer     ☐ En curso     ☑ Hecho          Commit: Sprint 4: reportes, sesiÃ³n y APK</w:t>
             </w:r>
             <w:proofErr w:type="spellStart"/>
             <w:r>
@@ -27364,7 +27364,7 @@
                 <w:szCs w:val="19"/>
                 <w:lang w:val="en-US"/>
               </w:rPr>
-              <w:t xml:space="preserve">â˜  Build â†’ Generate Signed App Bundle or APK â†’ APK release con </w:t>
+              <w:t xml:space="preserve">☑  GeneraciÃ³n de APK instalable y compilado exitoso</w:t>
             </w:r>
             <w:proofErr w:type="spellStart"/>
             <w:r>
@@ -27511,7 +27511,7 @@
                 <w:sz w:val="19"/>
                 <w:szCs w:val="19"/>
               </w:rPr>
-              <w:t xml:space="preserve">â˜ Por hacer     â˜ En curso     â˜ Hecho          </w:t>
+              <w:t xml:space="preserve">☑  Commit Â«Sprint 4: reportes, sesiÃ³n y APKÂ» y tag v1.0</w:t>
             </w:r>
             <w:proofErr w:type="spellStart"/>
             <w:r>
@@ -27747,6 +27747,13 @@
             <w:pPr>
               <w:spacing w:after="40"/>
             </w:pPr>
+            <w:r>
+              <w:rPr>
+                <w:sz w:val="19"/>
+                <w:szCs w:val="19"/>
+              </w:rPr>
+              <w:t>05/10/2026</w:t>
+            </w:r>
           </w:p>
         </w:tc>
         <w:tc>
@@ -27769,6 +27776,13 @@
             <w:pPr>
               <w:spacing w:after="40"/>
             </w:pPr>
+            <w:r>
+              <w:rPr>
+                <w:sz w:val="19"/>
+                <w:szCs w:val="19"/>
+              </w:rPr>
+              <w:t>ImplementaciÃ³n de notificaciÃ³n de pedido por WhatsApp (HU-10) y persistencia de sesiÃ³n recordada con SharedPreferences (HU-13).</w:t>
+            </w:r>
           </w:p>
         </w:tc>
         <w:tc>
@@ -27791,6 +27805,13 @@
             <w:pPr>
               <w:spacing w:after="40"/>
             </w:pPr>
+            <w:r>
+              <w:rPr>
+                <w:sz w:val="19"/>
+                <w:szCs w:val="19"/>
+              </w:rPr>
+              <w:t>Construir gestiÃ³n de pedidos con atenciÃ³n transaccional y validaciÃ³n de stock (HU-11).</w:t>
+            </w:r>
           </w:p>
         </w:tc>
         <w:tc>
@@ -27813,6 +27834,13 @@
             <w:pPr>
               <w:spacing w:after="40"/>
             </w:pPr>
+            <w:r>
+              <w:rPr>
+                <w:sz w:val="19"/>
+                <w:szCs w:val="19"/>
+              </w:rPr>
+              <w:t>Ninguno</w:t>
+            </w:r>
           </w:p>
         </w:tc>
       </w:tr>
@@ -27844,6 +27872,13 @@
             <w:pPr>
               <w:spacing w:after="40"/>
             </w:pPr>
+            <w:r>
+              <w:rPr>
+                <w:sz w:val="19"/>
+                <w:szCs w:val="19"/>
+              </w:rPr>
+              <w:t>05/10/2026</w:t>
+            </w:r>
           </w:p>
         </w:tc>
         <w:tc>
@@ -27867,6 +27902,13 @@
             <w:pPr>
               <w:spacing w:after="40"/>
             </w:pPr>
+            <w:r>
+              <w:rPr>
+                <w:sz w:val="19"/>
+                <w:szCs w:val="19"/>
+              </w:rPr>
+              <w:t>Desarrollo de PedidosActivity, DetallePedidoActivity, ReportesActivity con grÃ¡ficos de stock y ClientesActivity (HU-11 y HU-12).</w:t>
+            </w:r>
           </w:p>
         </w:tc>
         <w:tc>
@@ -27890,6 +27932,13 @@
             <w:pPr>
               <w:spacing w:after="40"/>
             </w:pPr>
+            <w:r>
+              <w:rPr>
+                <w:sz w:val="19"/>
+                <w:szCs w:val="19"/>
+              </w:rPr>
+              <w:t>GeneraciÃ³n del APK compilado, pruebas finales de aceptaciÃ³n y cierre del proyecto.</w:t>
+            </w:r>
           </w:p>
         </w:tc>
         <w:tc>
@@ -27913,6 +27962,13 @@
             <w:pPr>
               <w:spacing w:after="40"/>
             </w:pPr>
+            <w:r>
+              <w:rPr>
+                <w:sz w:val="19"/>
+                <w:szCs w:val="19"/>
+              </w:rPr>
+              <w:t>Ninguno</w:t>
+            </w:r>
           </w:p>
         </w:tc>
       </w:tr>
@@ -28204,7 +28260,7 @@
                 <w:sz w:val="19"/>
                 <w:szCs w:val="19"/>
               </w:rPr>
-              <w:t>â˜ SÃ­   â˜ No</w:t>
+              <w:t>☑ SÃ­   ☐ No</w:t>
             </w:r>
           </w:p>
         </w:tc>
@@ -28228,6 +28284,13 @@
             <w:pPr>
               <w:spacing w:after="40"/>
             </w:pPr>
+            <w:r>
+              <w:rPr>
+                <w:sz w:val="19"/>
+                <w:szCs w:val="19"/>
+              </w:rPr>
+              <w:t>Commit: Sprint 4: reportes, sesiÃ³n y APK. DiÃ¡logo de confirmaciÃ³n con dos botones de WhatsApp (al cliente y al negocio) y captura de ActivityNotFoundException.</w:t>
+            </w:r>
           </w:p>
         </w:tc>
         <w:tc>
@@ -28250,6 +28313,13 @@
             <w:pPr>
               <w:spacing w:after="40"/>
             </w:pPr>
+            <w:r>
+              <w:rPr>
+                <w:sz w:val="19"/>
+                <w:szCs w:val="19"/>
+              </w:rPr>
+              <w:t>Aprobado</w:t>
+            </w:r>
           </w:p>
         </w:tc>
       </w:tr>
@@ -28316,7 +28386,7 @@
                 <w:sz w:val="19"/>
                 <w:szCs w:val="19"/>
               </w:rPr>
-              <w:t>â˜ SÃ­   â˜ No</w:t>
+              <w:t>☑ SÃ­   ☐ No</w:t>
             </w:r>
           </w:p>
         </w:tc>
@@ -28341,6 +28411,13 @@
             <w:pPr>
               <w:spacing w:after="40"/>
             </w:pPr>
+            <w:r>
+              <w:rPr>
+                <w:sz w:val="19"/>
+                <w:szCs w:val="19"/>
+              </w:rPr>
+              <w:t>Commit: Sprint 4: reportes, sesiÃ³n y APK. PedidosActivity con selector Pendientes/Atendidos, DetallePedidoActivity con atenciÃ³n atÃ³mica y validaciÃ³n de stock insuficiente.</w:t>
+            </w:r>
           </w:p>
         </w:tc>
         <w:tc>
@@ -28364,6 +28441,13 @@
             <w:pPr>
               <w:spacing w:after="40"/>
             </w:pPr>
+            <w:r>
+              <w:rPr>
+                <w:sz w:val="19"/>
+                <w:szCs w:val="19"/>
+              </w:rPr>
+              <w:t>Aprobado</w:t>
+            </w:r>
           </w:p>
         </w:tc>
       </w:tr>
@@ -28428,7 +28512,7 @@
                 <w:sz w:val="19"/>
                 <w:szCs w:val="19"/>
               </w:rPr>
-              <w:t>â˜ SÃ­   â˜ No</w:t>
+              <w:t>☑ SÃ­   ☐ No</w:t>
             </w:r>
           </w:p>
         </w:tc>
@@ -28452,6 +28536,13 @@
             <w:pPr>
               <w:spacing w:after="40"/>
             </w:pPr>
+            <w:r>
+              <w:rPr>
+                <w:sz w:val="19"/>
+                <w:szCs w:val="19"/>
+              </w:rPr>
+              <w:t>Commit: Sprint 4: reportes, sesiÃ³n y APK. ReportesActivity con ventas acumuladas de atendidos, tarjetas de conteo, barras de stock con alerta roja &lt;= 3 y ClientesActivity con buscador.</w:t>
+            </w:r>
           </w:p>
         </w:tc>
         <w:tc>
@@ -28474,6 +28565,13 @@
             <w:pPr>
               <w:spacing w:after="40"/>
             </w:pPr>
+            <w:r>
+              <w:rPr>
+                <w:sz w:val="19"/>
+                <w:szCs w:val="19"/>
+              </w:rPr>
+              <w:t>Aprobado</w:t>
+            </w:r>
           </w:p>
         </w:tc>
       </w:tr>
@@ -28540,7 +28638,7 @@
                 <w:sz w:val="19"/>
                 <w:szCs w:val="19"/>
               </w:rPr>
-              <w:t>â˜ SÃ­   â˜ No</w:t>
+              <w:t>☑ SÃ­   ☐ No</w:t>
             </w:r>
           </w:p>
         </w:tc>
@@ -28565,6 +28663,13 @@
             <w:pPr>
               <w:spacing w:after="40"/>
             </w:pPr>
+            <w:r>
+              <w:rPr>
+                <w:sz w:val="19"/>
+                <w:szCs w:val="19"/>
+              </w:rPr>
+              <w:t>Commit: Sprint 4: reportes, sesiÃ³n y APK. SessionManager con SharedPreferences (login automÃ¡tico y botÃ³n Salir) y generaciÃ³n de APK instalable app-debug.apk.</w:t>
+            </w:r>
           </w:p>
         </w:tc>
         <w:tc>
@@ -28588,6 +28693,13 @@
             <w:pPr>
               <w:spacing w:after="40"/>
             </w:pPr>
+            <w:r>
+              <w:rPr>
+                <w:sz w:val="19"/>
+                <w:szCs w:val="19"/>
+              </w:rPr>
+              <w:t>Aprobado</w:t>
+            </w:r>
           </w:p>
         </w:tc>
       </w:tr>
@@ -28762,6 +28874,13 @@
             <w:pPr>
               <w:spacing w:after="40"/>
             </w:pPr>
+            <w:r>
+              <w:rPr>
+                <w:sz w:val="19"/>
+                <w:szCs w:val="19"/>
+              </w:rPr>
+              <w:t>La validaciÃ³n de inventario antes de marcar como atendido garantizÃ³ la integridad del stock. Los reportes y filtros en tiempo real responden de manera instantÃ¡nea y limpia.</w:t>
+            </w:r>
           </w:p>
         </w:tc>
         <w:tc>
@@ -28784,6 +28903,13 @@
             <w:pPr>
               <w:spacing w:after="40"/>
             </w:pPr>
+            <w:r>
+              <w:rPr>
+                <w:sz w:val="19"/>
+                <w:szCs w:val="19"/>
+              </w:rPr>
+              <w:t>Optimizar la compresiÃ³n de imÃ¡genes al capturar fotos desde la cÃ¡mara para reducir el almacenamiento SQLite.</w:t>
+            </w:r>
           </w:p>
         </w:tc>
         <w:tc>
@@ -28806,6 +28932,13 @@
             <w:pPr>
               <w:spacing w:after="40"/>
             </w:pPr>
+            <w:r>
+              <w:rPr>
+                <w:sz w:val="19"/>
+                <w:szCs w:val="19"/>
+              </w:rPr>
+              <w:t>Proyecto completado con Ã©xito al 100% (55/55 puntos). Preparar material para la sustentaciÃ³n y demo final.</w:t>
+            </w:r>
           </w:p>
         </w:tc>
       </w:tr>
@@ -29465,6 +29598,13 @@
             <w:pPr>
               <w:spacing w:after="40"/>
             </w:pPr>
+            <w:r>
+              <w:rPr>
+                <w:sz w:val="19"/>
+                <w:szCs w:val="19"/>
+              </w:rPr>
+              <w:t>18</w:t>
+            </w:r>
           </w:p>
         </w:tc>
         <w:tc>
@@ -29488,6 +29628,13 @@
             <w:pPr>
               <w:spacing w:after="40"/>
             </w:pPr>
+            <w:r>
+              <w:rPr>
+                <w:sz w:val="19"/>
+                <w:szCs w:val="19"/>
+              </w:rPr>
+              <w:t>100%</w:t>
+            </w:r>
           </w:p>
         </w:tc>
       </w:tr>
@@ -29576,6 +29723,13 @@
             <w:pPr>
               <w:spacing w:after="40"/>
             </w:pPr>
+            <w:r>
+              <w:rPr>
+                <w:sz w:val="19"/>
+                <w:szCs w:val="19"/>
+              </w:rPr>
+              <w:t>55</w:t>
+            </w:r>
           </w:p>
         </w:tc>
         <w:tc>
@@ -29598,6 +29752,13 @@
             <w:pPr>
               <w:spacing w:after="40"/>
             </w:pPr>
+            <w:r>
+              <w:rPr>
+                <w:sz w:val="19"/>
+                <w:szCs w:val="19"/>
+              </w:rPr>
+              <w:t>100%</w:t>
+            </w:r>
           </w:p>
         </w:tc>
       </w:tr>

</xml_diff>